<commit_message>
docs(bdr): E06-S01, E03-S05 and E01-S11 are Done; buffered search moves to E05-S05 (review)
Addresses Bl0oper's review on #194.

- T-66: E06-S01 (SCRUM-45) is Done, so the buffered search is a scenario of
  E05-S05, as T-66 already did for the Done calendar story E05-S03.
- T-74: E06-S01, E03-S05 (SCRUM-35) and E01-S11 (SCRUM-25) move to the Done
  list; the Safety Review handling for the latter two is in E08-S06.
- C-69: "E03-S01 is rewritten" corrected to "new requests go to an
  unassigned queue the Lead works from (E03-S08, T-70)", matching T-70.
- G change log Done list updated; BDR docx regenerated.
</commit_message>
<xml_diff>
--- a/docs/BACKLOG DECISION REVIEW CAA 031026.docx
+++ b/docs/BACKLOG DECISION REVIEW CAA 031026.docx
@@ -5446,7 +5446,7 @@
           </w:tcPr>
           <w:p>
             <w:r>
-              <w:t>**New requirement** (a new role and a new workflow) that supersedes the behaviour of a Done story; E03-S01 stays Done and the queue is a new story (T-74). Adds a sixth role. Supersedes C-41 and C-55: new requests are no longer auto-assigned, so T-14 is retired and E03-S01 is rewritten around an unassigned queue the Lead works from (T-70). Coordinators manage only events assigned to them, extending E01-S02 to a second role; the Lead sees every assignment and active event. Assignment and reassignment notify the affected users through E11-S01. Partially supersedes C-56: the Lead may reassign. Accounts are pre-seeded under C-57; ADR-012 one-role-per-account still holds (T-72). Open: one Lead or several (O-35), whether a Lead reassignment needs acceptance (O-36), Coordinator-initiated reassignment requests (O-37), queue visibility (O-38).</w:t>
+              <w:t>**New requirement** (a new role and a new workflow) that supersedes the behaviour of a Done story; E03-S01 stays Done and the queue is a new story (T-74). Adds a sixth role. Supersedes C-41 and C-55: new requests are no longer auto-assigned, so T-14 is retired and new requests go to an unassigned queue the Lead works from (E03-S08, T-70). Coordinators manage only events assigned to them, extending E01-S02 to a second role; the Lead sees every assignment and active event. Assignment and reassignment notify the affected users through E11-S01. Partially supersedes C-56: the Lead may reassign. Accounts are pre-seeded under C-57; ADR-012 one-role-per-account still holds (T-72). Open: one Lead or several (O-35), whether a Lead reassignment needs acceptance (O-36), Coordinator-initiated reassignment requests (O-37), queue visibility (O-38).</w:t>
             </w:r>
           </w:p>
         </w:tc>
@@ -9029,7 +9029,7 @@
           </w:tcPr>
           <w:p>
             <w:r>
-              <w:t>C-65 reverses C-18 and C-38, so the explicit customer exclusion that deferred E05-S05 no longer applies. Setup and turnaround are two whole-minute attributes of a venue, set by Venue Staff on the venue record; E05-S01 is Done, so the configure scenario belongs to E05-S05 rather than being added to E05-S01 (T-74). They default to 0 for every existing venue so no data migration changes current availability on its own. A booking's occupancy window is [start minus setup, end plus turnaround]; every availability display and conflict check uses that window instead of the advertised start and end. E05-S03 (calendar) is Done, so the calendar's buffered display is a scenario of E05-S05; E06-S01, E06-S03, E06-S04, E06-S05 and E06-S06 are not started and gain a buffer scenario each in place (T-74). Tentative holds occupy the venue, so they carry the buffers too. Maintenance blocks are a property of the venue itself and are not buffered (O-22). When a buffer is created or changed and an existing booking now overlaps, the booking is flagged as Conflicting and left in place; nothing is released automatically, matching the customer's "identified rather than silently removed". Who sees the flag and whether the save is allowed are O-20 and O-21; the story is written to the defaults recorded there. ADR-003's exclusion constraint must operate on the buffered range, which is the architecture PR's job.</w:t>
+              <w:t>C-65 reverses C-18 and C-38, so the explicit customer exclusion that deferred E05-S05 no longer applies. Setup and turnaround are two whole-minute attributes of a venue, set by Venue Staff on the venue record; E05-S01 is Done, so the configure scenario belongs to E05-S05 rather than being added to E05-S01 (T-74). They default to 0 for every existing venue so no data migration changes current availability on its own. A booking's occupancy window is [start minus setup, end plus turnaround]; every availability display and conflict check uses that window instead of the advertised start and end. E05-S03 (calendar) and E06-S01 (search) are Done, so the buffered calendar display and the buffered search are scenarios of E05-S05; E06-S03, E06-S04, E06-S05 and E06-S06 are not started and gain a buffer scenario each in place (T-74). Tentative holds occupy the venue, so they carry the buffers too. Maintenance blocks are a property of the venue itself and are not buffered (O-22). When a buffer is created or changed and an existing booking now overlaps, the booking is flagged as Conflicting and left in place; nothing is released automatically, matching the customer's "identified rather than silently removed". Who sees the flag and whether the save is allowed are O-20 and O-21; the story is written to the defaults recorded there. ADR-003's exclusion constraint must operate on the buffered range, which is the architecture PR's job.</w:t>
             </w:r>
           </w:p>
         </w:tc>
@@ -9445,7 +9445,7 @@
           </w:tcPr>
           <w:p>
             <w:r>
-              <w:t>The Week 7 guide ("Managing Changes", Scenarios 1 to 3) sets the rule: a new requirement never reopens a Done story, it becomes a new story with its own criteria and estimate, and the Done story keeps its points so velocity history stays honest; a Done story is reopened, and only its remaining work estimated, when an original criterion was missed or implemented wrongly; an incomplete story simply has its criteria updated. Applied to the Week 7 changes: E03-S01, E05-S01, E05-S03, E01-S01 and E01-S02 are Done and stay Done, with any superseded scenario marked "Superseded by Exx-Sxx (C-nn)" in the backlog rather than deleted; E06-S03, E06-S05, E06-S06, E08-S03, E08-S04, E03-S05, E01-S11, E10-S02 and E11-S01 are not Done and are updated in place; E05-S04 is in the Sprint 2 sprint backlog and is neither edited nor reopened, its correction being the new story under T-67. No Week 7 change is a Scenario 1 or 3 reopening: no original criterion has been found unsatisfied. When a Done story's original criteria could be affected by a new story (E03-S01's status transition, E05-S03's calendar states, E01-S02's Organiser isolation), the new story's test cases include a regression case asserting the original behaviour still holds, per guide step 3.</w:t>
+              <w:t>The Week 7 guide ("Managing Changes", Scenarios 1 to 3) sets the rule: a new requirement never reopens a Done story, it becomes a new story with its own criteria and estimate, and the Done story keeps its points so velocity history stays honest; a Done story is reopened, and only its remaining work estimated, when an original criterion was missed or implemented wrongly; an incomplete story simply has its criteria updated. Applied to the Week 7 changes: E03-S01, E05-S01, E05-S03, E06-S01, E03-S05, E01-S01, E01-S02 and E01-S11 are Done and stay Done, with any superseded scenario marked "Superseded by Exx-Sxx (C-nn)" in the backlog rather than deleted and any new behaviour placed in a new story (E06-S01's buffered search in E05-S05; E03-S05's and E01-S11's Safety Review handling in E08-S06); E06-S03, E06-S05, E06-S06, E08-S03, E08-S04, E10-S02 and E11-S01 are not Done and are updated in place; E05-S04 is in the Sprint 2 sprint backlog and is neither edited nor reopened, its correction being the new story under T-67. No Week 7 change is a Scenario 1 or 3 reopening: no original criterion has been found unsatisfied. When a Done story's original criteria could be affected by a new story (E03-S01's status transition, E05-S03's calendar states, E01-S02's Organiser isolation), the new story's test cases include a regression case asserting the original behaviour still holds, per guide step 3.</w:t>
             </w:r>
           </w:p>
         </w:tc>
@@ -10874,17 +10874,17 @@
           </w:tcPr>
           <w:p>
             <w:r>
-              <w:t>Week 7 change 2: is a booking restored if the venue reopens before the event</w:t>
-            </w:r>
-          </w:p>
-        </w:tc>
-        <w:tc>
-          <w:tcPr>
-            <w:tcW w:type="dxa" w:w="1728"/>
-          </w:tcPr>
-          <w:p>
-            <w:r>
-              <w:t>Open. Default: no; a Conflicting booking is released for good and the Coordinator re-requests if the venue is wanted again. Q&amp;A question: "If a venue becomes available again before the event date, does the original booking come back automatically, or has it been released?"</w:t>
+              <w:t>Week 7 change 2: what happens to a Conflicting booking if the unavailability ends before the event</w:t>
+            </w:r>
+          </w:p>
+        </w:tc>
+        <w:tc>
+          <w:tcPr>
+            <w:tcW w:type="dxa" w:w="1728"/>
+          </w:tcPr>
+          <w:p>
+            <w:r>
+              <w:t>Open. Default, consistent with T-67 (bookings are flagged Conflicting, never released automatically): if the unavailability is shortened or ended while the booking is still Conflicting, the flag clears and the booking stands as before; a booking the Coordinator has already cancelled or replaced is not restored. Q&amp;A question: "If a venue becomes available again before the event date, should a booking that was flagged as conflicting simply return to normal, or should the Coordinator have to re-request it?"</w:t>
             </w:r>
           </w:p>
         </w:tc>
@@ -14286,7 +14286,7 @@
     </w:p>
     <w:p>
       <w:r>
-        <w:t>Applied the Week 7 "Managing Changes" guide (T-74). Each change is classified in its section A row (five new requirements, one correction plus new requirement). Done stories touched by a change (E03-S01, E05-S01, E05-S03, E01-S01, E01-S02) stay Done and the new behaviour becomes new stories; To Do stories are updated in place; E05-S04, in the Sprint 2 sprint backlog, is left alone and corrected by a new story. Estimation rule recorded in T-73: new stories estimated at planning, changed To Do stories re-estimated only if materially different, Done stories never, in-flight stories for remaining work.</w:t>
+        <w:t>Applied the Week 7 "Managing Changes" guide (T-74). Each change is classified in its section A row (five new requirements, one correction plus new requirement). Done stories touched by a change (E03-S01, E05-S01, E05-S03, E06-S01, E03-S05, E01-S01, E01-S02, E01-S11) stay Done and the new behaviour becomes new stories; To Do stories are updated in place; E05-S04, in the Sprint 2 sprint backlog, is left alone and corrected by a new story. Estimation rule recorded in T-73: new stories estimated at planning, changed To Do stories re-estimated only if materially different, Done stories never, in-flight stories for remaining work.</w:t>
       </w:r>
     </w:p>
     <w:p>

</xml_diff>